<commit_message>
set up create acc and login system
</commit_message>
<xml_diff>
--- a/Transfer Project Taras.docx
+++ b/Transfer Project Taras.docx
@@ -1631,10 +1631,26 @@
         <w:t xml:space="preserve">I </w:t>
       </w:r>
       <w:r>
-        <w:t xml:space="preserve">like the dark theme used here and also the selected seats being displayed with a small person icon however I don’t like the </w:t>
-      </w:r>
-      <w:r>
-        <w:t xml:space="preserve">bland looking seats so I will try to implement the dark theme into my system and also </w:t>
+        <w:t xml:space="preserve">like the dark theme used here </w:t>
+      </w:r>
+      <w:proofErr w:type="gramStart"/>
+      <w:r>
+        <w:t>and also</w:t>
+      </w:r>
+      <w:proofErr w:type="gramEnd"/>
+      <w:r>
+        <w:t xml:space="preserve"> the selected seats being displayed with a small person icon however I don’t like the </w:t>
+      </w:r>
+      <w:r>
+        <w:t xml:space="preserve">bland looking seats so I will try to implement the dark theme into my system </w:t>
+      </w:r>
+      <w:proofErr w:type="gramStart"/>
+      <w:r>
+        <w:t>and also</w:t>
+      </w:r>
+      <w:proofErr w:type="gramEnd"/>
+      <w:r>
+        <w:t xml:space="preserve"> </w:t>
       </w:r>
       <w:r>
         <w:t xml:space="preserve">the seating layout is diverse so I will try to create an exotic layout </w:t>
@@ -1690,11 +1706,24 @@
       </w:r>
     </w:p>
     <w:p>
-      <w:r>
-        <w:t xml:space="preserve">Also the ability to select the seat pricing is </w:t>
-      </w:r>
-      <w:r>
-        <w:t>cool with the seat types being colour coded for easy of use</w:t>
+      <w:proofErr w:type="gramStart"/>
+      <w:r>
+        <w:t>Also</w:t>
+      </w:r>
+      <w:proofErr w:type="gramEnd"/>
+      <w:r>
+        <w:t xml:space="preserve"> the ability to select the seat pricing is </w:t>
+      </w:r>
+      <w:r>
+        <w:t xml:space="preserve">cool with the seat types being colour coded for </w:t>
+      </w:r>
+      <w:proofErr w:type="spellStart"/>
+      <w:r>
+        <w:t>easy</w:t>
+      </w:r>
+      <w:proofErr w:type="spellEnd"/>
+      <w:r>
+        <w:t xml:space="preserve"> of use</w:t>
       </w:r>
     </w:p>
     <w:p>
@@ -1805,7 +1834,15 @@
         <w:t xml:space="preserve">this cinema website has included a time selection and a date selection menu before reaching the </w:t>
       </w:r>
       <w:r>
-        <w:t>seat selection page which is a good feature but I don’t think ill do this since the performances at the college will always take place at the same time but I will need to allow the user to select the date since the performances happen on different days</w:t>
+        <w:t xml:space="preserve">seat selection page which is a good feature but I don’t think </w:t>
+      </w:r>
+      <w:proofErr w:type="spellStart"/>
+      <w:r>
+        <w:t>ill</w:t>
+      </w:r>
+      <w:proofErr w:type="spellEnd"/>
+      <w:r>
+        <w:t xml:space="preserve"> do this since the performances at the college will always take place at the same time but I will need to allow the user to select the date since the performances happen on different days</w:t>
       </w:r>
     </w:p>
     <w:p>
@@ -1851,7 +1888,15 @@
         </w:drawing>
       </w:r>
       <w:r>
-        <w:t xml:space="preserve">the website then prompts you to login or continue as a guest which I </w:t>
+        <w:t xml:space="preserve">the website then prompts you to login or </w:t>
+      </w:r>
+      <w:proofErr w:type="gramStart"/>
+      <w:r>
+        <w:t>continue</w:t>
+      </w:r>
+      <w:proofErr w:type="gramEnd"/>
+      <w:r>
+        <w:t xml:space="preserve"> as a guest which I </w:t>
       </w:r>
       <w:r>
         <w:t>might</w:t>
@@ -2063,7 +2108,15 @@
         <w:t>This system has high redundancy due to the need to record all</w:t>
       </w:r>
       <w:r>
-        <w:t xml:space="preserve"> data about each record each time even if its not directly related to the booking such as the </w:t>
+        <w:t xml:space="preserve"> data about each record each time even if </w:t>
+      </w:r>
+      <w:proofErr w:type="spellStart"/>
+      <w:r>
+        <w:t>its</w:t>
+      </w:r>
+      <w:proofErr w:type="spellEnd"/>
+      <w:r>
+        <w:t xml:space="preserve"> not directly related to the booking such as the </w:t>
       </w:r>
       <w:r>
         <w:t>user’s</w:t>
@@ -2738,7 +2791,15 @@
         <w:t xml:space="preserve"> These should be detailed enough </w:t>
       </w:r>
       <w:r>
-        <w:t xml:space="preserve">that another person could make your system and it will look as you envision. </w:t>
+        <w:t xml:space="preserve">that another person could make your </w:t>
+      </w:r>
+      <w:proofErr w:type="gramStart"/>
+      <w:r>
+        <w:t>system</w:t>
+      </w:r>
+      <w:proofErr w:type="gramEnd"/>
+      <w:r>
+        <w:t xml:space="preserve"> and it will look as you envision. </w:t>
       </w:r>
     </w:p>
     <w:p>
@@ -2753,13 +2814,21 @@
     </w:p>
     <w:p>
       <w:r>
-        <w:t>Include all your UML here, this could be</w:t>
+        <w:t xml:space="preserve">Include all your UML here, this could </w:t>
+      </w:r>
+      <w:proofErr w:type="gramStart"/>
+      <w:r>
+        <w:t>be</w:t>
       </w:r>
       <w:r>
         <w:t xml:space="preserve"> </w:t>
       </w:r>
       <w:r>
-        <w:t xml:space="preserve"> an ERD</w:t>
+        <w:t xml:space="preserve"> an</w:t>
+      </w:r>
+      <w:proofErr w:type="gramEnd"/>
+      <w:r>
+        <w:t xml:space="preserve"> ERD</w:t>
       </w:r>
       <w:r>
         <w:t xml:space="preserve">, </w:t>
@@ -3065,11 +3134,32 @@
     </w:p>
     <w:p/>
     <w:p>
-      <w:r>
-        <w:t xml:space="preserve">Im trying to design the button layout for the theatre </w:t>
-      </w:r>
-      <w:r>
-        <w:t xml:space="preserve">and the seat icons aren’t aligning directly on the buttons which are layed out as intended. I think I will crop the images very precisely on the left hand side so that when they are placed in the button </w:t>
+      <w:proofErr w:type="spellStart"/>
+      <w:r>
+        <w:t>Im</w:t>
+      </w:r>
+      <w:proofErr w:type="spellEnd"/>
+      <w:r>
+        <w:t xml:space="preserve"> trying to design the button layout for the theatre </w:t>
+      </w:r>
+      <w:r>
+        <w:t xml:space="preserve">and the seat icons aren’t aligning directly on the buttons which are </w:t>
+      </w:r>
+      <w:proofErr w:type="spellStart"/>
+      <w:r>
+        <w:t>layed</w:t>
+      </w:r>
+      <w:proofErr w:type="spellEnd"/>
+      <w:r>
+        <w:t xml:space="preserve"> out as intended. I think I will crop the images very precisely on the </w:t>
+      </w:r>
+      <w:proofErr w:type="gramStart"/>
+      <w:r>
+        <w:t>left hand</w:t>
+      </w:r>
+      <w:proofErr w:type="gramEnd"/>
+      <w:r>
+        <w:t xml:space="preserve"> side so that when they are placed in the button </w:t>
       </w:r>
       <w:r>
         <w:t>from the left it begins with the actual visible part of the icon.</w:t>
@@ -3182,8 +3272,13 @@
       <w:r>
         <w:t xml:space="preserve"> </w:t>
       </w:r>
-      <w:r>
-        <w:t xml:space="preserve">cropped the image very tightly but that didn’t help so I will try to align the image to the left and see if that </w:t>
+      <w:proofErr w:type="gramStart"/>
+      <w:r>
+        <w:t>cropped</w:t>
+      </w:r>
+      <w:proofErr w:type="gramEnd"/>
+      <w:r>
+        <w:t xml:space="preserve"> the image very tightly but that didn’t help so I will try to align the image to the left and see if that </w:t>
       </w:r>
       <w:r>
         <w:t>helps</w:t>
@@ -3285,10 +3380,26 @@
         <w:pStyle w:val="NoSpacing"/>
       </w:pPr>
       <w:r>
-        <w:t>I managed to get the bottom row to work as imtented with the seats aligning in the center</w:t>
-      </w:r>
-      <w:r>
-        <w:t>, now I will remove all the colouring and apply the same padding-0 to the rest of the buttons</w:t>
+        <w:t xml:space="preserve">I managed to get the bottom row to work as </w:t>
+      </w:r>
+      <w:proofErr w:type="spellStart"/>
+      <w:r>
+        <w:t>imtented</w:t>
+      </w:r>
+      <w:proofErr w:type="spellEnd"/>
+      <w:r>
+        <w:t xml:space="preserve"> with the seats aligning in the center</w:t>
+      </w:r>
+      <w:r>
+        <w:t xml:space="preserve">, now I will remove all the </w:t>
+      </w:r>
+      <w:proofErr w:type="spellStart"/>
+      <w:r>
+        <w:t>colouring</w:t>
+      </w:r>
+      <w:proofErr w:type="spellEnd"/>
+      <w:r>
+        <w:t xml:space="preserve"> and apply the same padding-0 to the rest of the buttons</w:t>
       </w:r>
     </w:p>
     <w:p>
@@ -3390,11 +3501,24 @@
         <w:pStyle w:val="NoSpacing"/>
       </w:pPr>
       <w:r>
-        <w:t>I asked chat gpt the prompt ‘how can I hash a password for a login system?’</w:t>
-      </w:r>
-      <w:r>
-        <w:t xml:space="preserve"> and it returned to me with a python library called bcrypt</w:t>
-      </w:r>
+        <w:t xml:space="preserve">I asked chat </w:t>
+      </w:r>
+      <w:proofErr w:type="spellStart"/>
+      <w:r>
+        <w:t>gpt</w:t>
+      </w:r>
+      <w:proofErr w:type="spellEnd"/>
+      <w:r>
+        <w:t xml:space="preserve"> the prompt ‘how can I hash a password for a login system?’</w:t>
+      </w:r>
+      <w:r>
+        <w:t xml:space="preserve"> and it returned to me with a python library called </w:t>
+      </w:r>
+      <w:proofErr w:type="spellStart"/>
+      <w:r>
+        <w:t>bcrypt</w:t>
+      </w:r>
+      <w:proofErr w:type="spellEnd"/>
       <w:r>
         <w:t xml:space="preserve"> which applies a salt to the password and then hashes it where the hash then becomes </w:t>
       </w:r>
@@ -3417,18 +3541,63 @@
       <w:pPr>
         <w:pStyle w:val="NoSpacing"/>
       </w:pPr>
-      <w:r>
-        <w:t xml:space="preserve">However upon trying to set up bcrypt I ran into several compatibility issues with the packages to I decided to look again for another hashing library and I found a built in python hashing library called </w:t>
-      </w:r>
-      <w:r>
-        <w:t>hashlib.</w:t>
-      </w:r>
-    </w:p>
-    <w:p>
-      <w:pPr>
-        <w:pStyle w:val="NoSpacing"/>
-      </w:pPr>
-      <w:r>
+      <w:proofErr w:type="gramStart"/>
+      <w:r>
+        <w:t>However</w:t>
+      </w:r>
+      <w:proofErr w:type="gramEnd"/>
+      <w:r>
+        <w:t xml:space="preserve"> upon trying to set up </w:t>
+      </w:r>
+      <w:proofErr w:type="spellStart"/>
+      <w:r>
+        <w:t>bcrypt</w:t>
+      </w:r>
+      <w:proofErr w:type="spellEnd"/>
+      <w:r>
+        <w:t xml:space="preserve"> I ran into several compatibility issues with the packages </w:t>
+      </w:r>
+      <w:proofErr w:type="gramStart"/>
+      <w:r>
+        <w:t>to</w:t>
+      </w:r>
+      <w:proofErr w:type="gramEnd"/>
+      <w:r>
+        <w:t xml:space="preserve"> I decided to look again for another hashing </w:t>
+      </w:r>
+      <w:proofErr w:type="gramStart"/>
+      <w:r>
+        <w:t>library</w:t>
+      </w:r>
+      <w:proofErr w:type="gramEnd"/>
+      <w:r>
+        <w:t xml:space="preserve"> and I found a </w:t>
+      </w:r>
+      <w:proofErr w:type="gramStart"/>
+      <w:r>
+        <w:t>built in</w:t>
+      </w:r>
+      <w:proofErr w:type="gramEnd"/>
+      <w:r>
+        <w:t xml:space="preserve"> python hashing library called </w:t>
+      </w:r>
+      <w:proofErr w:type="spellStart"/>
+      <w:r>
+        <w:t>hashlib</w:t>
+      </w:r>
+      <w:proofErr w:type="spellEnd"/>
+      <w:r>
+        <w:t>.</w:t>
+      </w:r>
+    </w:p>
+    <w:p>
+      <w:pPr>
+        <w:pStyle w:val="NoSpacing"/>
+      </w:pPr>
+      <w:r>
+        <w:rPr>
+          <w:noProof/>
+        </w:rPr>
         <w:drawing>
           <wp:inline distT="0" distB="0" distL="0" distR="0" wp14:anchorId="0020B74C" wp14:editId="28856E0F">
             <wp:extent cx="5731510" cy="2956560"/>
@@ -3477,10 +3646,20 @@
         <w:t>password hashing function pbkdf2_hmac</w:t>
       </w:r>
       <w:r>
-        <w:t xml:space="preserve"> and all its parameters and suggestions such as using os.</w:t>
-      </w:r>
-      <w:r>
-        <w:t>urandom to generate a random string of bytes to be used as the salt</w:t>
+        <w:t xml:space="preserve"> and all its parameters and suggestions such as using </w:t>
+      </w:r>
+      <w:proofErr w:type="spellStart"/>
+      <w:proofErr w:type="gramStart"/>
+      <w:r>
+        <w:t>os.</w:t>
+      </w:r>
+      <w:r>
+        <w:t>urandom</w:t>
+      </w:r>
+      <w:proofErr w:type="spellEnd"/>
+      <w:proofErr w:type="gramEnd"/>
+      <w:r>
+        <w:t xml:space="preserve"> to generate a random string of bytes to be used as the salt</w:t>
       </w:r>
     </w:p>
     <w:p>
@@ -4104,7 +4283,15 @@
         </w:numPr>
       </w:pPr>
       <w:r>
-        <w:t>Compared the system you have made with those you researched for your desk based research</w:t>
+        <w:t xml:space="preserve">Compared the system you have made with those you researched for your </w:t>
+      </w:r>
+      <w:proofErr w:type="gramStart"/>
+      <w:r>
+        <w:t>desk based</w:t>
+      </w:r>
+      <w:proofErr w:type="gramEnd"/>
+      <w:r>
+        <w:t xml:space="preserve"> research</w:t>
       </w:r>
       <w:r>
         <w:t>.</w:t>
@@ -5773,6 +5960,26 @@
 </file>
 
 <file path=customXml/item3.xml><?xml version="1.0" encoding="utf-8"?>
+<?mso-contentType ?>
+<FormTemplates xmlns="http://schemas.microsoft.com/sharepoint/v3/contenttype/forms">
+  <Display>DocumentLibraryForm</Display>
+  <Edit>DocumentLibraryForm</Edit>
+  <New>DocumentLibraryForm</New>
+</FormTemplates>
+</file>
+
+<file path=customXml/item4.xml><?xml version="1.0" encoding="utf-8"?>
+<p:properties xmlns:p="http://schemas.microsoft.com/office/2006/metadata/properties" xmlns:xsi="http://www.w3.org/2001/XMLSchema-instance" xmlns:pc="http://schemas.microsoft.com/office/infopath/2007/PartnerControls">
+  <documentManagement>
+    <TaxCatchAll xmlns="10d644ba-cf16-43e8-a31a-a6f565d9c224" xsi:nil="true"/>
+    <lcf76f155ced4ddcb4097134ff3c332f xmlns="9f27979c-cb1a-4f8c-bada-64f9d3ac4d94">
+      <Terms xmlns="http://schemas.microsoft.com/office/infopath/2007/PartnerControls"/>
+    </lcf76f155ced4ddcb4097134ff3c332f>
+  </documentManagement>
+</p:properties>
+</file>
+
+<file path=customXml/item5.xml><?xml version="1.0" encoding="utf-8"?>
 <ct:contentTypeSchema xmlns:ct="http://schemas.microsoft.com/office/2006/metadata/contentType" xmlns:ma="http://schemas.microsoft.com/office/2006/metadata/properties/metaAttributes" ct:_="" ma:_="" ma:contentTypeName="Document" ma:contentTypeID="0x010100B31D159F86750749BAD869CB65D39E6C" ma:contentTypeVersion="18" ma:contentTypeDescription="Create a new document." ma:contentTypeScope="" ma:versionID="5875106e85ea39da84f0ce8eea51069e">
   <xsd:schema xmlns:xsd="http://www.w3.org/2001/XMLSchema" xmlns:xs="http://www.w3.org/2001/XMLSchema" xmlns:p="http://schemas.microsoft.com/office/2006/metadata/properties" xmlns:ns2="9f27979c-cb1a-4f8c-bada-64f9d3ac4d94" xmlns:ns3="10d644ba-cf16-43e8-a31a-a6f565d9c224" targetNamespace="http://schemas.microsoft.com/office/2006/metadata/properties" ma:root="true" ma:fieldsID="1e2bf1858abb715b81b46f96cb448a94" ns2:_="" ns3:_="">
     <xsd:import namespace="9f27979c-cb1a-4f8c-bada-64f9d3ac4d94"/>
@@ -6027,26 +6234,6 @@
 </ct:contentTypeSchema>
 </file>
 
-<file path=customXml/item4.xml><?xml version="1.0" encoding="utf-8"?>
-<p:properties xmlns:p="http://schemas.microsoft.com/office/2006/metadata/properties" xmlns:xsi="http://www.w3.org/2001/XMLSchema-instance" xmlns:pc="http://schemas.microsoft.com/office/infopath/2007/PartnerControls">
-  <documentManagement>
-    <TaxCatchAll xmlns="10d644ba-cf16-43e8-a31a-a6f565d9c224" xsi:nil="true"/>
-    <lcf76f155ced4ddcb4097134ff3c332f xmlns="9f27979c-cb1a-4f8c-bada-64f9d3ac4d94">
-      <Terms xmlns="http://schemas.microsoft.com/office/infopath/2007/PartnerControls"/>
-    </lcf76f155ced4ddcb4097134ff3c332f>
-  </documentManagement>
-</p:properties>
-</file>
-
-<file path=customXml/item5.xml><?xml version="1.0" encoding="utf-8"?>
-<?mso-contentType ?>
-<FormTemplates xmlns="http://schemas.microsoft.com/sharepoint/v3/contenttype/forms">
-  <Display>DocumentLibraryForm</Display>
-  <Edit>DocumentLibraryForm</Edit>
-  <New>DocumentLibraryForm</New>
-</FormTemplates>
-</file>
-
 <file path=customXml/itemProps1.xml><?xml version="1.0" encoding="utf-8"?>
 <ds:datastoreItem xmlns:ds="http://schemas.openxmlformats.org/officeDocument/2006/customXml" ds:itemID="{55AF091B-3C7A-41E3-B477-F2FDAA23CFDA}">
   <ds:schemaRefs>
@@ -6064,6 +6251,25 @@
 </file>
 
 <file path=customXml/itemProps3.xml><?xml version="1.0" encoding="utf-8"?>
+<ds:datastoreItem xmlns:ds="http://schemas.openxmlformats.org/officeDocument/2006/customXml" ds:itemID="{C696176E-F620-41C5-9561-9A23D6610C91}">
+  <ds:schemaRefs>
+    <ds:schemaRef ds:uri="http://schemas.microsoft.com/sharepoint/v3/contenttype/forms"/>
+  </ds:schemaRefs>
+</ds:datastoreItem>
+</file>
+
+<file path=customXml/itemProps4.xml><?xml version="1.0" encoding="utf-8"?>
+<ds:datastoreItem xmlns:ds="http://schemas.openxmlformats.org/officeDocument/2006/customXml" ds:itemID="{AE2997B2-E581-4E45-91DC-C3D67DC89CB7}">
+  <ds:schemaRefs>
+    <ds:schemaRef ds:uri="http://schemas.microsoft.com/office/2006/metadata/properties"/>
+    <ds:schemaRef ds:uri="http://schemas.microsoft.com/office/infopath/2007/PartnerControls"/>
+    <ds:schemaRef ds:uri="10d644ba-cf16-43e8-a31a-a6f565d9c224"/>
+    <ds:schemaRef ds:uri="9f27979c-cb1a-4f8c-bada-64f9d3ac4d94"/>
+  </ds:schemaRefs>
+</ds:datastoreItem>
+</file>
+
+<file path=customXml/itemProps5.xml><?xml version="1.0" encoding="utf-8"?>
 <ds:datastoreItem xmlns:ds="http://schemas.openxmlformats.org/officeDocument/2006/customXml" ds:itemID="{FE9CC5A2-3041-4A1A-81A1-13C6C3808D74}">
   <ds:schemaRefs>
     <ds:schemaRef ds:uri="http://schemas.microsoft.com/office/2006/metadata/contentType"/>
@@ -6080,23 +6286,4 @@
     <ds:schemaRef ds:uri="http://schemas.microsoft.com/internal/obd"/>
   </ds:schemaRefs>
 </ds:datastoreItem>
-</file>
-
-<file path=customXml/itemProps4.xml><?xml version="1.0" encoding="utf-8"?>
-<ds:datastoreItem xmlns:ds="http://schemas.openxmlformats.org/officeDocument/2006/customXml" ds:itemID="{AE2997B2-E581-4E45-91DC-C3D67DC89CB7}">
-  <ds:schemaRefs>
-    <ds:schemaRef ds:uri="http://schemas.microsoft.com/office/2006/metadata/properties"/>
-    <ds:schemaRef ds:uri="http://schemas.microsoft.com/office/infopath/2007/PartnerControls"/>
-    <ds:schemaRef ds:uri="10d644ba-cf16-43e8-a31a-a6f565d9c224"/>
-    <ds:schemaRef ds:uri="9f27979c-cb1a-4f8c-bada-64f9d3ac4d94"/>
-  </ds:schemaRefs>
-</ds:datastoreItem>
-</file>
-
-<file path=customXml/itemProps5.xml><?xml version="1.0" encoding="utf-8"?>
-<ds:datastoreItem xmlns:ds="http://schemas.openxmlformats.org/officeDocument/2006/customXml" ds:itemID="{C696176E-F620-41C5-9561-9A23D6610C91}">
-  <ds:schemaRefs>
-    <ds:schemaRef ds:uri="http://schemas.microsoft.com/sharepoint/v3/contenttype/forms"/>
-  </ds:schemaRefs>
-</ds:datastoreItem>
 </file>
</xml_diff>